<commit_message>
Update the resume: Time Doctor frame, trimmed to one page
</commit_message>
<xml_diff>
--- a/Kim_Julongbayan_Resume.docx
+++ b/Kim_Julongbayan_Resume.docx
@@ -252,35 +252,25 @@
         <w:rPr>
           <w:sz w:val="20"/>
         </w:rPr>
-        <w:t>Sole engineer on the internal timekeeping and billing platform (TypeScript, Fastify, Supabase/Postgres, Chrome MV3 extension) used every workday by 1</w:t>
+        <w:t xml:space="preserve">Sole engineer on a tamper-proof timekeeping and billing platform (TypeScript, Fastify, Supabase/Postgres, Chrome MV3), used every workday by 15 people. The inverse of tools like Time Doctor: server-set timestamps, append-only records, no screenshots. Built its vanilla-JS admin dashboard </w:t>
       </w:r>
       <w:r>
         <w:rPr>
           <w:sz w:val="20"/>
         </w:rPr>
-        <w:t>5</w:t>
+        <w:t>-</w:t>
       </w:r>
       <w:r>
         <w:rPr>
           <w:sz w:val="20"/>
         </w:rPr>
-        <w:t xml:space="preserve"> people: a nursing team working remotely across the Philippines, and the owner in the US.</w:t>
+        <w:t xml:space="preserve"> seven surfaces, live nurse status streaming in over Postgres realtime</w:t>
       </w:r>
-    </w:p>
-    <w:p>
-      <w:pPr>
-        <w:pStyle w:val="ListBullet"/>
-        <w:spacing w:after="30" w:line="240" w:lineRule="auto"/>
-        <w:rPr>
-          <w:sz w:val="20"/>
-          <w:szCs w:val="20"/>
-        </w:rPr>
-      </w:pPr>
       <w:r>
         <w:rPr>
           <w:sz w:val="20"/>
         </w:rPr>
-        <w:t>Built the admin dashboard in vanilla JS - 6,000+ lines across seven surfaces (live overview, timesheets, payroll, invoicing, corrections, team) with nurse status streaming in over Postgres realtime.</w:t>
+        <w:t>.</w:t>
       </w:r>
     </w:p>
     <w:p>
@@ -490,7 +480,7 @@
           <w:sz w:val="20"/>
           <w:szCs w:val="20"/>
         </w:rPr>
-        <w:t xml:space="preserve">Rewrote an n8n workflow as a self-hosted Python package: five job-board JSON APIs, IMAP alerts, HTML as last resort; hard filters run before scoring so a rejected job never costs an LLM call.</w:t>
+        <w:t>Rewrote an n8n workflow as a self-hosted Python package: five job-board JSON APIs, IMAP alerts, HTML as last resort; hard filters run before scoring so a rejected job never costs an LLM call.</w:t>
       </w:r>
     </w:p>
     <w:p>
@@ -716,7 +706,7 @@
   <w:abstractNum w:abstractNumId="8" w15:restartNumberingAfterBreak="0">
     <w:nsid w:val="FFFFFF89"/>
     <w:multiLevelType w:val="singleLevel"/>
-    <w:tmpl w:val="7B2809F4"/>
+    <w:tmpl w:val="7CD69172"/>
     <w:lvl w:ilvl="0">
       <w:start w:val="1"/>
       <w:numFmt w:val="bullet"/>

</xml_diff>

<commit_message>
Resume: MDS Pro dates from February 2026
The contract started in Feb 2026; June was the mdspromonitor repo's first
commit, which dates the code rather than the contract. Restores the space
after the separator that the hand edit dropped.

Co-Authored-By: Claude Opus 5.5 <noreply@anthropic.com>
</commit_message>
<xml_diff>
--- a/Kim_Julongbayan_Resume.docx
+++ b/Kim_Julongbayan_Resume.docx
@@ -236,7 +236,19 @@
         <w:rPr>
           <w:b/>
         </w:rPr>
-        <w:t xml:space="preserve"> - Full Stack Developer (Contract) | June 2026 - Present</w:t>
+        <w:t xml:space="preserve"> - Full Stack Developer (Contract) | </w:t>
+      </w:r>
+      <w:r>
+        <w:rPr>
+          <w:b/>
+        </w:rPr>
+        <w:t>February</w:t>
+      </w:r>
+      <w:r>
+        <w:rPr>
+          <w:b/>
+        </w:rPr>
+        <w:t xml:space="preserve"> 2026 - Present</w:t>
       </w:r>
     </w:p>
     <w:p>

</xml_diff>

<commit_message>
Correct professional experience to three years
</commit_message>
<xml_diff>
--- a/Kim_Julongbayan_Resume.docx
+++ b/Kim_Julongbayan_Resume.docx
@@ -134,7 +134,7 @@
         <w:rPr>
           <w:sz w:val="20"/>
         </w:rPr>
-        <w:t>Full Stack Developer with 5+ years of on-and-off experience building independent projects and one production system in daily use - scalable web, mobile, and AI-integrated systems.</w:t>
+        <w:t>Full Stack Developer with 3 years of professional software development experience building web, mobile, and AI-integrated systems, including a production platform in daily use.</w:t>
       </w:r>
     </w:p>
     <w:p>
@@ -341,7 +341,7 @@
         <w:rPr>
           <w:b/>
         </w:rPr>
-        <w:t>Independent Full Stack Developer | 2018 – Present</w:t>
+        <w:t>Independent Full Stack Developer | 2021 – Present</w:t>
       </w:r>
     </w:p>
     <w:p>

</xml_diff>